<commit_message>
Replace binary maturity trigger with refinancing-gap ramp
Maturity default probability now ramps linearly from 0 at 85% exit
mark-to-market LTV to 1 at the existing 105% hard trigger, capturing the
refi-gap channel (positive paper equity but too little for a par take-out)
that the binary test ignored -- historically the dominant CMBS default mode.
One extra uniform draw per sim (u_def now n_sim x 12).

Sweep re-run with raised quantile targets; winner keeps all hazard/floor
parameters and moves mat_cure 0.20 -> 0.30. Mid-ladder sectors lift ~1-2 bps
(median 6.7 -> 7.6); Full-Service Hotels trims to 48.6, back under the
50 bps ceiling. Methodology doc updated (sec 6.3, Appendix A).

Co-Authored-By: Claude Fable 5 <noreply@anthropic.com>
</commit_message>
<xml_diff>
--- a/MIM_Stochastic_Model_Methodology.docx
+++ b/MIM_Stochastic_Model_Methodology.docx
@@ -997,7 +997,7 @@
           <w:sz w:val="22"/>
           <w:szCs w:val="22"/>
         </w:rPr>
-        <w:t xml:space="preserve">Surviving the ten hold years is not enough: at maturity the balloon comes due, and repayment stops being optional. Every scenario that reaches year ten without a term default faces a final test — if the mark-to-market loan-to-value at exit exceeds 105%, the borrower cannot refinance or sell to retire the loan, will not write a check to cover negative equity, and the loan defaults at maturity. Unlike the term years, this test is deterministic: a scenario that ends with the property worth less than the loan always books the outcome, rather than depending on a probability draw. Mildly underwater exits (up to 105%) are assumed to extend or bridge.</w:t>
+        <w:t xml:space="preserve">Surviving the ten hold years is not enough: at maturity the balloon comes due, and repayment stops being optional. Every scenario that reaches year ten without a term default faces a value test based on its mark-to-market loan-to-value at exit. Below 85%, the balloon refinances comfortably and the loan repays in full. Above 105% — the property worth less than the loan by more than any sponsor would bridge — the loan always defaults. Between those two points sits the refinancing gap: the property has positive equity on paper, but a take-out lender will only size a new loan to roughly 70–75% of value, leaving a hole the sponsor must fill. Default probability rises smoothly across that zone (a loan exiting at 95% LTV defaults about half the time). Historically, this refinancing-gap channel — not outright negative equity — is where most commercial mortgage defaults occur.</w:t>
       </w:r>
     </w:p>
     <w:p>
@@ -1010,7 +1010,7 @@
           <w:sz w:val="22"/>
           <w:szCs w:val="22"/>
         </w:rPr>
-        <w:t xml:space="preserve">Of the loans that fail the maturity test, 20% are assumed to cure — resolve through extension or workout with no principal loss, as values recover — consistent with rating-agency evidence that many defaults at moderate leverage ultimately repay (KBRA’s single-borrower study shows blended loss severity of ~11% across all resolved defaults, versus ~40% conditional on a meaningful loss). Cured loans count as defaults with zero loss, so reported default rates are comparable to published default studies and reported severity is a blended figure.</w:t>
+        <w:t xml:space="preserve">Of the loans that default at maturity, 30% are assumed to cure — resolve through extension or workout with no principal loss, as values recover — consistent with rating-agency evidence that many defaults at moderate leverage ultimately repay (KBRA’s single-borrower study shows blended loss severity of ~11% across all resolved defaults, versus ~40% conditional on a meaningful loss). Cured loans count as defaults with zero loss, so reported default rates are comparable to published default studies and reported severity is a blended figure.</w:t>
       </w:r>
     </w:p>
     <w:p>
@@ -1606,7 +1606,7 @@
           <w:sz w:val="22"/>
           <w:szCs w:val="22"/>
         </w:rPr>
-        <w:t xml:space="preserve">The model’s current output spans roughly 6 to 51 basis points per year across the 21 sectors, with an ordering that matches this historical record — hotels and cold storage at the top, driven largely by the maturity test (they are the sectors most likely to be worth less than the loan at exit), and medical office, manufactured housing, net-lease, and stabilized housing at the bottom. The calibration procedure scores candidate parameters on both the level of the ladder and its ordering against the historical record, and the script is retained alongside the model so parameters can be re-tuned quickly whenever inputs are refreshed or new loss data becomes available.</w:t>
+        <w:t xml:space="preserve">The model’s current output spans roughly 5 to 49 basis points per year across the 21 sectors, with an ordering that matches this historical record — hotels and cold storage at the top, driven largely by the maturity test (they are the sectors most likely to be worth less than the loan at exit), and medical office, manufactured housing, net-lease, and stabilized housing at the bottom. The calibration procedure scores candidate parameters on both the level of the ladder and its ordering against the historical record, and the script is retained alongside the model so parameters can be re-tuned quickly whenever inputs are refreshed or new loss data becomes available.</w:t>
       </w:r>
     </w:p>
     <w:p>
@@ -3210,7 +3210,7 @@
                 <w:sz w:val="20"/>
                 <w:szCs w:val="20"/>
               </w:rPr>
-              <w:t xml:space="preserve">Exit mark-to-market LTV &gt; 105% → default at balloon (deterministic)</w:t>
+              <w:t xml:space="preserve">Refinancing-gap ramp on exit mark-to-market LTV: P=0 below 85%, rising linearly to P=1 at 105%</w:t>
             </w:r>
           </w:p>
         </w:tc>
@@ -3234,7 +3234,7 @@
                 <w:sz w:val="20"/>
                 <w:szCs w:val="20"/>
               </w:rPr>
-              <w:t xml:space="preserve">Balloon repayment risk</w:t>
+              <w:t xml:space="preserve">Balloon repayment / refi-gap risk</w:t>
             </w:r>
           </w:p>
         </w:tc>
@@ -3284,7 +3284,7 @@
                 <w:sz w:val="20"/>
                 <w:szCs w:val="20"/>
               </w:rPr>
-              <w:t xml:space="preserve">20% of maturity defaults resolve with no principal loss</w:t>
+              <w:t xml:space="preserve">30% of maturity defaults resolve with no principal loss</w:t>
             </w:r>
           </w:p>
         </w:tc>

</xml_diff>

<commit_message>
Raise worst-sector EL ceiling to ~65bps; extend refi-gap ramp to 80% LTV
Per calibration decision: the ~50bps worst-sector cap was suppressing the
cross-sector average (the top two sectors dominate the mean, and the sweep
kept trimming them to stay under the ceiling). Targets raised to
median 12 / max 65; ramp now starts at 80% exit LTV (was 85%), cure back
to 0.20, and the term hazard firms up (a0 -6.5 -> -6.0, a1 1.5 -> 2.0,
a3 1.0 -> 1.5).

Ladder: 5.6 (Medical Office) -> 62.0 bps (Full-Service Hotels), mean 11.5,
median 8.3, ordering unchanged. Worst-sector level consistent with
historical 60-150bps range for hotels through the cycle. Methodology doc
updated (sec 6.3 ramp bounds, exec summary, Appendix A).

Co-Authored-By: Claude Fable 5 <noreply@anthropic.com>
</commit_message>
<xml_diff>
--- a/MIM_Stochastic_Model_Methodology.docx
+++ b/MIM_Stochastic_Model_Methodology.docx
@@ -191,7 +191,7 @@
           <w:sz w:val="22"/>
           <w:szCs w:val="22"/>
         </w:rPr>
-        <w:t xml:space="preserve">The credit component was recalibrated in July 2026 against published historical loss data for U.S. commercial mortgages (Fitch, KBRA, Moody’s, and NAIC sources), and captures both ways a mortgage actually fails: default during the term (cash flow stops covering debt service) and default at maturity (the property is worth too little to refinance the balloon). Annual expected credit losses range from roughly 6 basis points per year for the most stable sectors (net-lease retail, manufactured housing, moderate-income housing) to roughly 50 basis points for the most volatile (full-service hotels) — a range consistent with several decades of realized experience for institutional-quality senior mortgages.</w:t>
+        <w:t xml:space="preserve">The credit component was recalibrated in July 2026 against published historical loss data for U.S. commercial mortgages (Fitch, KBRA, Moody’s, and NAIC sources), and captures both ways a mortgage actually fails: default during the term (cash flow stops covering debt service) and default at maturity (the property is worth too little to refinance the balloon). Annual expected credit losses range from roughly 6 basis points per year for the most stable sectors (net-lease retail, manufactured housing, moderate-income housing) to roughly 60 basis points for the most volatile (full-service hotels) — a range consistent with several decades of realized experience for institutional-quality senior mortgages.</w:t>
       </w:r>
     </w:p>
     <w:p>
@@ -997,7 +997,7 @@
           <w:sz w:val="22"/>
           <w:szCs w:val="22"/>
         </w:rPr>
-        <w:t xml:space="preserve">Surviving the ten hold years is not enough: at maturity the balloon comes due, and repayment stops being optional. Every scenario that reaches year ten without a term default faces a value test based on its mark-to-market loan-to-value at exit. Below 85%, the balloon refinances comfortably and the loan repays in full. Above 105% — the property worth less than the loan by more than any sponsor would bridge — the loan always defaults. Between those two points sits the refinancing gap: the property has positive equity on paper, but a take-out lender will only size a new loan to roughly 70–75% of value, leaving a hole the sponsor must fill. Default probability rises smoothly across that zone (a loan exiting at 95% LTV defaults about half the time). Historically, this refinancing-gap channel — not outright negative equity — is where most commercial mortgage defaults occur.</w:t>
+        <w:t xml:space="preserve">Surviving the ten hold years is not enough: at maturity the balloon comes due, and repayment stops being optional. Every scenario that reaches year ten without a term default faces a value test based on its mark-to-market loan-to-value at exit. Below 80%, the balloon refinances comfortably and the loan repays in full. Above 105% — the property worth less than the loan by more than any sponsor would bridge — the loan always defaults. Between those two points sits the refinancing gap: the property has positive equity on paper, but a take-out lender will only size a new loan to roughly 70–75% of value, leaving a hole the sponsor must fill. Default probability rises smoothly across that zone (a loan exiting at 92.5% LTV defaults about half the time). Historically, this refinancing-gap channel — not outright negative equity — is where most commercial mortgage defaults occur.</w:t>
       </w:r>
     </w:p>
     <w:p>
@@ -1010,7 +1010,7 @@
           <w:sz w:val="22"/>
           <w:szCs w:val="22"/>
         </w:rPr>
-        <w:t xml:space="preserve">Of the loans that default at maturity, 30% are assumed to cure — resolve through extension or workout with no principal loss, as values recover — consistent with rating-agency evidence that many defaults at moderate leverage ultimately repay (KBRA’s single-borrower study shows blended loss severity of ~11% across all resolved defaults, versus ~40% conditional on a meaningful loss). Cured loans count as defaults with zero loss, so reported default rates are comparable to published default studies and reported severity is a blended figure.</w:t>
+        <w:t xml:space="preserve">Of the loans that default at maturity, 20% are assumed to cure — resolve through extension or workout with no principal loss, as values recover — consistent with rating-agency evidence that many defaults at moderate leverage ultimately repay (KBRA’s single-borrower study shows blended loss severity of ~11% across all resolved defaults, versus ~40% conditional on a meaningful loss). Cured loans count as defaults with zero loss, so reported default rates are comparable to published default studies and reported severity is a blended figure.</w:t>
       </w:r>
     </w:p>
     <w:p>
@@ -1606,7 +1606,7 @@
           <w:sz w:val="22"/>
           <w:szCs w:val="22"/>
         </w:rPr>
-        <w:t xml:space="preserve">The model’s current output spans roughly 5 to 49 basis points per year across the 21 sectors, with an ordering that matches this historical record — hotels and cold storage at the top, driven largely by the maturity test (they are the sectors most likely to be worth less than the loan at exit), and medical office, manufactured housing, net-lease, and stabilized housing at the bottom. The calibration procedure scores candidate parameters on both the level of the ladder and its ordering against the historical record, and the script is retained alongside the model so parameters can be re-tuned quickly whenever inputs are refreshed or new loss data becomes available.</w:t>
+        <w:t xml:space="preserve">The model’s current output spans roughly 6 to 62 basis points per year across the 21 sectors, with an ordering that matches this historical record — hotels and cold storage at the top, driven largely by the maturity test (they are the sectors most likely to be worth less than the loan at exit), and medical office, manufactured housing, net-lease, and stabilized housing at the bottom. The calibration procedure scores candidate parameters on both the level of the ladder and its ordering against the historical record, and the script is retained alongside the model so parameters can be re-tuned quickly whenever inputs are refreshed or new loss data becomes available.</w:t>
       </w:r>
     </w:p>
     <w:p>
@@ -3062,7 +3062,7 @@
                 <w:sz w:val="20"/>
                 <w:szCs w:val="20"/>
               </w:rPr>
-              <w:t xml:space="preserve">Logistic annual EDF in DSCR distress/safety and mark-to-market LTV; intercept −6.5, distress +1.5, safety −1.31, LTV +1.0</w:t>
+              <w:t xml:space="preserve">Logistic annual EDF in DSCR distress/safety and mark-to-market LTV; intercept −6.0, distress +2.0, safety −1.31, LTV +1.5</w:t>
             </w:r>
           </w:p>
         </w:tc>
@@ -3210,7 +3210,7 @@
                 <w:sz w:val="20"/>
                 <w:szCs w:val="20"/>
               </w:rPr>
-              <w:t xml:space="preserve">Refinancing-gap ramp on exit mark-to-market LTV: P=0 below 85%, rising linearly to P=1 at 105%</w:t>
+              <w:t xml:space="preserve">Refinancing-gap ramp on exit mark-to-market LTV: P=0 below 80%, rising linearly to P=1 at 105%</w:t>
             </w:r>
           </w:p>
         </w:tc>
@@ -3284,7 +3284,7 @@
                 <w:sz w:val="20"/>
                 <w:szCs w:val="20"/>
               </w:rPr>
-              <w:t xml:space="preserve">30% of maturity defaults resolve with no principal loss</w:t>
+              <w:t xml:space="preserve">20% of maturity defaults resolve with no principal loss</w:t>
             </w:r>
           </w:p>
         </w:tc>

</xml_diff>

<commit_message>
Recalibrate core EL band to 10-25 bps per NAIC CM1/CM2 anchors
Per calibration decision: most sectors should carry 10-25 bps annual EL
(NAIC CM1 ~10bps / CM2 ~20bps implied EL for IO loans at this leverage;
CMBS 2.0 experience 15-30bps), with a few life-co-quality outliers below
10 and the hotel/cold-storage tail above.

Two parameter changes, chosen by the sweep against the new quantile
targets (min 7 / q25 11 / median 15 / q75 21 / max 62):
- edf_floor 0.4% -> 0.6%/yr (IO loans, no amortization cushion)
- refi-gap ramp start 0.80 -> 0.75 exit LTV (75% is the real max take-out)

Ladder: 8.7 (Medical Office) to 65.3 bps (Full-Service Hotels); 8 sectors
just below 10, 11 in the 10-25 core, mean 14.8, median 11.5. Ordering
unchanged. Methodology doc updated (floors, ramp bounds, exec summary,
sec 6.6 range).

Co-Authored-By: Claude Fable 5 <noreply@anthropic.com>
</commit_message>
<xml_diff>
--- a/MIM_Stochastic_Model_Methodology.docx
+++ b/MIM_Stochastic_Model_Methodology.docx
@@ -191,7 +191,7 @@
           <w:sz w:val="22"/>
           <w:szCs w:val="22"/>
         </w:rPr>
-        <w:t xml:space="preserve">The credit component was recalibrated in July 2026 against published historical loss data for U.S. commercial mortgages (Fitch, KBRA, Moody’s, and NAIC sources), and captures both ways a mortgage actually fails: default during the term (cash flow stops covering debt service) and default at maturity (the property is worth too little to refinance the balloon). Annual expected credit losses range from roughly 6 basis points per year for the most stable sectors (net-lease retail, manufactured housing, moderate-income housing) to roughly 60 basis points for the most volatile (full-service hotels) — a range consistent with several decades of realized experience for institutional-quality senior mortgages.</w:t>
+        <w:t xml:space="preserve">The credit component was recalibrated in July 2026 against published historical loss data for U.S. commercial mortgages (Fitch, KBRA, Moody’s, and NAIC sources), and captures both ways a mortgage actually fails: default during the term (cash flow stops covering debt service) and default at maturity (the property is worth too little to refinance the balloon). Annual expected credit losses range from roughly 9 basis points per year for the most stable sectors (medical office, manufactured housing, single-family rentals) through a 10–25 basis-point core — consistent with the expected-loss levels embedded in NAIC risk-based-capital factors for loans of this profile — to roughly 65 basis points for the most volatile sector (full-service hotels).</w:t>
       </w:r>
     </w:p>
     <w:p>
@@ -967,7 +967,7 @@
           <w:sz w:val="22"/>
           <w:szCs w:val="22"/>
         </w:rPr>
-        <w:t xml:space="preserve">Two floors keep the model honest at the safe end. First, annual default probability never falls below 0.4% per year, no matter how strong coverage looks — history shows performing, well-covered commercial mortgages still default occasionally, for idiosyncratic reasons (tenant bankruptcy, fraud, environmental events) that coverage ratios cannot see. Second, loss severity given default never falls below 15% — even a well-collateralized workout incurs legal, servicing, and disposition costs.</w:t>
+        <w:t xml:space="preserve">Two floors keep the model honest at the safe end. First, annual default probability never falls below 0.6% per year, no matter how strong coverage looks — history shows performing, well-covered commercial mortgages still default for idiosyncratic reasons (tenant bankruptcy, fraud, environmental events) that coverage ratios cannot see, and interest-only loans carry no amortization cushion. Second, loss severity given default never falls below 15% — even a well-collateralized workout incurs legal, servicing, and disposition costs.</w:t>
       </w:r>
     </w:p>
     <w:p>
@@ -997,7 +997,7 @@
           <w:sz w:val="22"/>
           <w:szCs w:val="22"/>
         </w:rPr>
-        <w:t xml:space="preserve">Surviving the ten hold years is not enough: at maturity the balloon comes due, and repayment stops being optional. Every scenario that reaches year ten without a term default faces a value test based on its mark-to-market loan-to-value at exit. Below 80%, the balloon refinances comfortably and the loan repays in full. Above 105% — the property worth less than the loan by more than any sponsor would bridge — the loan always defaults. Between those two points sits the refinancing gap: the property has positive equity on paper, but a take-out lender will only size a new loan to roughly 70–75% of value, leaving a hole the sponsor must fill. Default probability rises smoothly across that zone (a loan exiting at 92.5% LTV defaults about half the time). Historically, this refinancing-gap channel — not outright negative equity — is where most commercial mortgage defaults occur.</w:t>
+        <w:t xml:space="preserve">Surviving the ten hold years is not enough: at maturity the balloon comes due, and repayment stops being optional. Every scenario that reaches year ten without a term default faces a value test based on its mark-to-market loan-to-value at exit. Below 75% — the leverage a take-out lender will actually provide — the balloon refinances comfortably and the loan repays in full. Above 105% — the property worth less than the loan by more than any sponsor would bridge — the loan always defaults. Between those two points sits the refinancing gap: the property has positive equity on paper, but a take-out lender will only size a new loan to roughly 70–75% of value, leaving a hole the sponsor must fill. Default probability rises smoothly across that zone (a loan exiting at 90% LTV defaults about half the time). Historically, this refinancing-gap channel — not outright negative equity — is where most commercial mortgage defaults occur.</w:t>
       </w:r>
     </w:p>
     <w:p>
@@ -1606,7 +1606,7 @@
           <w:sz w:val="22"/>
           <w:szCs w:val="22"/>
         </w:rPr>
-        <w:t xml:space="preserve">The model’s current output spans roughly 6 to 62 basis points per year across the 21 sectors, with an ordering that matches this historical record — hotels and cold storage at the top, driven largely by the maturity test (they are the sectors most likely to be worth less than the loan at exit), and medical office, manufactured housing, net-lease, and stabilized housing at the bottom. The calibration procedure scores candidate parameters on both the level of the ladder and its ordering against the historical record, and the script is retained alongside the model so parameters can be re-tuned quickly whenever inputs are refreshed or new loss data becomes available.</w:t>
+        <w:t xml:space="preserve">The model’s current output spans roughly 9 to 65 basis points per year across the 21 sectors, with a 10–25 basis-point core, with an ordering that matches this historical record — hotels and cold storage at the top, driven largely by the maturity test (they are the sectors most likely to be worth less than the loan at exit), and medical office, manufactured housing, net-lease, and stabilized housing at the bottom. The calibration procedure scores candidate parameters on both the level of the ladder and its ordering against the historical record, and the script is retained alongside the model so parameters can be re-tuned quickly whenever inputs are refreshed or new loss data becomes available.</w:t>
       </w:r>
     </w:p>
     <w:p>
@@ -3136,7 +3136,7 @@
                 <w:sz w:val="20"/>
                 <w:szCs w:val="20"/>
               </w:rPr>
-              <w:t xml:space="preserve">0.4% per year</w:t>
+              <w:t xml:space="preserve">0.6% per year</w:t>
             </w:r>
           </w:p>
         </w:tc>
@@ -3160,7 +3160,7 @@
                 <w:sz w:val="20"/>
                 <w:szCs w:val="20"/>
               </w:rPr>
-              <w:t xml:space="preserve">Idiosyncratic event risk</w:t>
+              <w:t xml:space="preserve">Idiosyncratic event risk (IO loans, no amortization cushion)</w:t>
             </w:r>
           </w:p>
         </w:tc>
@@ -3210,7 +3210,7 @@
                 <w:sz w:val="20"/>
                 <w:szCs w:val="20"/>
               </w:rPr>
-              <w:t xml:space="preserve">Refinancing-gap ramp on exit mark-to-market LTV: P=0 below 80%, rising linearly to P=1 at 105%</w:t>
+              <w:t xml:space="preserve">Refinancing-gap ramp on exit mark-to-market LTV: P=0 below 75%, rising linearly to P=1 at 105%</w:t>
             </w:r>
           </w:p>
         </w:tc>

</xml_diff>

<commit_message>
Document single-asset volatility convention in methodology
Input vols are single-asset, not index-level (index = portfolio vol with
idiosyncratic risk diversified away plus appraisal smoothing). The model
prices one representative asset per sector — one deal, one loan — so
inputs sitting well above index vols is by design, and risk metrics
describe standalone assets. Validate inputs against property-level data.

Co-Authored-By: Claude Fable 5 <noreply@anthropic.com>
</commit_message>
<xml_diff>
--- a/MIM_Stochastic_Model_Methodology.docx
+++ b/MIM_Stochastic_Model_Methodology.docx
@@ -444,6 +444,19 @@
           <w:szCs w:val="22"/>
         </w:rPr>
         <w:t xml:space="preserve">The volatility and skew columns are what make the model stochastic rather than deterministic — they encode, for example, that hotel revenue swings much harder than manufactured-housing revenue, and that revenue surprises in most sectors lean to the downside.</w:t>
+      </w:r>
+    </w:p>
+    <w:p>
+      <w:pPr>
+        <w:spacing w:after="160" w:line="276"/>
+      </w:pPr>
+      <w:r>
+        <w:rPr>
+          <w:rFonts w:ascii="Calibri" w:cs="Calibri" w:eastAsia="Calibri" w:hAnsi="Calibri"/>
+          <w:sz w:val="22"/>
+          <w:szCs w:val="22"/>
+        </w:rPr>
+        <w:t xml:space="preserve">One convention matters for interpreting every output: these are single-asset volatilities, not index volatilities. A property index is effectively a portfolio of thousands of assets — idiosyncratic events cancel across holdings and appraisal smoothing dampens what remains — so index volatility understates the risk of owning one building. The model deliberately prices one representative asset per sector (one deal on the equity side, one loan on the credit side), so its inputs sit well above index-level volatilities by design, and its risk metrics describe standalone assets rather than diversified portfolios. Inputs should accordingly be validated against property-level data, not index series.</w:t>
       </w:r>
     </w:p>
     <w:p>

</xml_diff>